<commit_message>
Pankreatitis DOCX: Originalzustand wiederhergestellt (Baustein 1/2/3 wieder drin)
</commit_message>
<xml_diff>
--- a/Pankreatitis_Arztbrief_Textbausteine.docx
+++ b/Pankreatitis_Arztbrief_Textbausteine.docx
@@ -5,23 +5,7 @@
     <w:p>
       <w:pPr>
         <w:shd w:fill="01696F" w:val="clear"/>
-        <w:spacing w:after="0" w:before="300"/>
-        <w:jc w:val="center"/>
-      </w:pPr>
-      <w:r>
-        <w:rPr>
-          <w:rFonts w:ascii="Segoe UI Emoji" w:cs="Segoe UI Emoji" w:eastAsia="Segoe UI Emoji" w:hAnsi="Segoe UI Emoji"/>
-          <w:color w:val="FFFFFF"/>
-          <w:sz w:val="80"/>
-          <w:szCs w:val="80"/>
-        </w:rPr>
-        <w:t xml:space="preserve">🪳</w:t>
-      </w:r>
-    </w:p>
-    <w:p>
-      <w:pPr>
-        <w:shd w:fill="01696F" w:val="clear"/>
-        <w:spacing w:after="60" w:before="0"/>
+        <w:spacing w:after="60" w:before="400"/>
         <w:jc w:val="center"/>
       </w:pPr>
       <w:r>
@@ -145,7 +129,7 @@
           <w:sz w:val="28"/>
           <w:szCs w:val="28"/>
         </w:rPr>
-        <w:t xml:space="preserve">Schwere / nekrotisierende Pankreatitis</w:t>
+        <w:t xml:space="preserve">BAUSTEIN 1 – Schwere / nekrotisierende Pankreatitis</w:t>
       </w:r>
     </w:p>
     <w:p>
@@ -576,7 +560,7 @@
           <w:sz w:val="28"/>
           <w:szCs w:val="28"/>
         </w:rPr>
-        <w:t xml:space="preserve">Kryptogene Pankreatitis &gt;40 Jahre</w:t>
+        <w:t xml:space="preserve">BAUSTEIN 2 – Kryptogene Pankreatitis &gt;40 Jahre</w:t>
       </w:r>
     </w:p>
     <w:p>
@@ -1007,7 +991,7 @@
           <w:sz w:val="28"/>
           <w:szCs w:val="28"/>
         </w:rPr>
-        <w:t xml:space="preserve">Alkohol-induzierte Pankreatitis (jeder Schweregrad)</w:t>
+        <w:t xml:space="preserve">BAUSTEIN 3 – Alkohol-induzierte Pankreatitis (jeder Schweregrad)</w:t>
       </w:r>
     </w:p>
     <w:p>

</xml_diff>

<commit_message>
Pankreatitis DOCX: Baustein 1/2/3 aus Überschriften entfernt
</commit_message>
<xml_diff>
--- a/Pankreatitis_Arztbrief_Textbausteine.docx
+++ b/Pankreatitis_Arztbrief_Textbausteine.docx
@@ -129,7 +129,7 @@
           <w:sz w:val="28"/>
           <w:szCs w:val="28"/>
         </w:rPr>
-        <w:t xml:space="preserve">BAUSTEIN 1 – Schwere / nekrotisierende Pankreatitis</w:t>
+        <w:t xml:space="preserve">Schwere / nekrotisierende Pankreatitis</w:t>
       </w:r>
     </w:p>
     <w:p>
@@ -560,7 +560,7 @@
           <w:sz w:val="28"/>
           <w:szCs w:val="28"/>
         </w:rPr>
-        <w:t xml:space="preserve">BAUSTEIN 2 – Kryptogene Pankreatitis &gt;40 Jahre</w:t>
+        <w:t xml:space="preserve">Kryptogene Pankreatitis &gt;40 Jahre</w:t>
       </w:r>
     </w:p>
     <w:p>
@@ -991,7 +991,7 @@
           <w:sz w:val="28"/>
           <w:szCs w:val="28"/>
         </w:rPr>
-        <w:t xml:space="preserve">BAUSTEIN 3 – Alkohol-induzierte Pankreatitis (jeder Schweregrad)</w:t>
+        <w:t xml:space="preserve">Alkohol-induzierte Pankreatitis (jeder Schweregrad)</w:t>
       </w:r>
     </w:p>
     <w:p>

</xml_diff>